<commit_message>
Use final basic VLX logo everywhere; add logo variants, glow art, ice banner; re-render banners, scenes, widgets and docs
Co-Authored-By: Claude Sonnet 5.5 <noreply@anthropic.com>
Claude-Session: https://claude.ai/code/session_016SgMPD7ForMheNgT1wyjzL
</commit_message>
<xml_diff>
--- a/esports-org/05_DOCS/docs/00_Organisations_Profil.docx
+++ b/esports-org/05_DOCS/docs/00_Organisations_Profil.docx
@@ -20,13 +20,38 @@
           </w:tcPr>
           <w:p>
             <w:r>
-              <w:rPr>
-                <w:b/>
-                <w:i w:val="0"/>
-                <w:color w:val="E4EAF2"/>
-                <w:sz w:val="48"/>
-              </w:rPr>
-              <w:t>VLX</w:t>
+              <w:drawing>
+                <wp:inline xmlns:a="http://schemas.openxmlformats.org/drawingml/2006/main" xmlns:pic="http://schemas.openxmlformats.org/drawingml/2006/picture">
+                  <wp:extent cx="1038397" cy="540000"/>
+                  <wp:docPr id="1" name="Picture 1"/>
+                  <wp:cNvGraphicFramePr>
+                    <a:graphicFrameLocks noChangeAspect="1"/>
+                  </wp:cNvGraphicFramePr>
+                  <a:graphic>
+                    <a:graphicData uri="http://schemas.openxmlformats.org/drawingml/2006/picture">
+                      <pic:pic>
+                        <pic:nvPicPr>
+                          <pic:cNvPr id="0" name="logo-main.png"/>
+                          <pic:cNvPicPr/>
+                        </pic:nvPicPr>
+                        <pic:blipFill>
+                          <a:blip r:embed="rId9"/>
+                          <a:stretch>
+                            <a:fillRect/>
+                          </a:stretch>
+                        </pic:blipFill>
+                        <pic:spPr>
+                          <a:xfrm>
+                            <a:off x="0" y="0"/>
+                            <a:ext cx="1038397" cy="540000"/>
+                          </a:xfrm>
+                          <a:prstGeom prst="rect"/>
+                        </pic:spPr>
+                      </pic:pic>
+                    </a:graphicData>
+                  </a:graphic>
+                </wp:inline>
+              </w:drawing>
             </w:r>
           </w:p>
         </w:tc>
@@ -315,7 +340,7 @@
       </w:r>
     </w:p>
     <w:sectPr>
-      <w:footerReference w:type="default" r:id="rId9"/>
+      <w:footerReference w:type="default" r:id="rId10"/>
       <w:pgSz w:w="12240" w:h="15840"/>
       <w:pgMar w:top="907" w:right="1247" w:bottom="1134" w:left="1247" w:header="720" w:footer="720" w:gutter="0"/>
       <w:cols w:space="720"/>

</xml_diff>